<commit_message>
Lab 8 - CPU Fetch and Decode
</commit_message>
<xml_diff>
--- a/Lab 7.docx
+++ b/Lab 7.docx
@@ -56,6 +56,7 @@
                 <w:lang w:val="en-US"/>
               </w:rPr>
             </w:pPr>
+            <w:proofErr w:type="gramStart"/>
             <w:r>
               <w:rPr>
                 <w:rFonts w:asciiTheme="minorHAnsi" w:eastAsia="Times New Roman" w:hAnsiTheme="minorHAnsi" w:cs="Times New Roman"/>
@@ -66,6 +67,7 @@
               </w:rPr>
               <w:t>Name :</w:t>
             </w:r>
+            <w:proofErr w:type="gramEnd"/>
             <w:r>
               <w:rPr>
                 <w:rFonts w:asciiTheme="minorHAnsi" w:eastAsia="Times New Roman" w:hAnsiTheme="minorHAnsi" w:cs="Times New Roman"/>
@@ -136,8 +138,20 @@
                 <w:szCs w:val="28"/>
                 <w:lang w:val="en-US"/>
               </w:rPr>
-              <w:t>Student ID :</w:t>
+              <w:t xml:space="preserve">Student </w:t>
             </w:r>
+            <w:proofErr w:type="gramStart"/>
+            <w:r>
+              <w:rPr>
+                <w:rFonts w:asciiTheme="minorHAnsi" w:eastAsia="Times New Roman" w:hAnsiTheme="minorHAnsi" w:cs="Times New Roman"/>
+                <w:b/>
+                <w:sz w:val="28"/>
+                <w:szCs w:val="28"/>
+                <w:lang w:val="en-US"/>
+              </w:rPr>
+              <w:t>ID :</w:t>
+            </w:r>
+            <w:proofErr w:type="gramEnd"/>
             <w:r>
               <w:rPr>
                 <w:rFonts w:asciiTheme="minorHAnsi" w:eastAsia="Times New Roman" w:hAnsiTheme="minorHAnsi" w:cs="Times New Roman"/>
@@ -764,7 +778,14 @@
         <w:rPr>
           <w:rFonts w:eastAsia="Times New Roman" w:cstheme="minorHAnsi"/>
         </w:rPr>
-        <w:t xml:space="preserve">Download the </w:t>
+        <w:t xml:space="preserve">Download </w:t>
+      </w:r>
+      <w:proofErr w:type="gramStart"/>
+      <w:r>
+        <w:rPr>
+          <w:rFonts w:eastAsia="Times New Roman" w:cstheme="minorHAnsi"/>
+        </w:rPr>
+        <w:t xml:space="preserve">the </w:t>
       </w:r>
       <w:r>
         <w:rPr>
@@ -772,6 +793,7 @@
         </w:rPr>
         <w:t>lab7</w:t>
       </w:r>
+      <w:proofErr w:type="gramEnd"/>
       <w:r>
         <w:rPr>
           <w:rFonts w:eastAsia="Times New Roman" w:cstheme="minorHAnsi"/>
@@ -829,18 +851,30 @@
         </w:rPr>
         <w:t xml:space="preserve">Now create a project under C development environment, such as </w:t>
       </w:r>
+      <w:proofErr w:type="spellStart"/>
+      <w:proofErr w:type="gramStart"/>
       <w:r>
         <w:rPr>
           <w:rFonts w:eastAsia="Times New Roman" w:cstheme="minorHAnsi"/>
         </w:rPr>
         <w:t>Code:Blocks</w:t>
       </w:r>
-      <w:r>
-        <w:rPr>
-          <w:rFonts w:eastAsia="Times New Roman" w:cstheme="minorHAnsi"/>
-        </w:rPr>
-        <w:t>, Netbeans</w:t>
-      </w:r>
+      <w:proofErr w:type="spellEnd"/>
+      <w:proofErr w:type="gramEnd"/>
+      <w:r>
+        <w:rPr>
+          <w:rFonts w:eastAsia="Times New Roman" w:cstheme="minorHAnsi"/>
+        </w:rPr>
+        <w:t xml:space="preserve">, </w:t>
+      </w:r>
+      <w:proofErr w:type="spellStart"/>
+      <w:r>
+        <w:rPr>
+          <w:rFonts w:eastAsia="Times New Roman" w:cstheme="minorHAnsi"/>
+        </w:rPr>
+        <w:t>Netbeans</w:t>
+      </w:r>
+      <w:proofErr w:type="spellEnd"/>
       <w:r>
         <w:rPr>
           <w:rFonts w:eastAsia="Times New Roman" w:cstheme="minorHAnsi"/>
@@ -879,14 +913,30 @@
           <w:rFonts w:eastAsia="Times New Roman" w:cstheme="minorHAnsi"/>
           <w:b/>
         </w:rPr>
-        <w:t>Hint: Starting from this week, the code will be more an</w:t>
-      </w:r>
-      <w:r>
-        <w:rPr>
-          <w:rFonts w:eastAsia="Times New Roman" w:cstheme="minorHAnsi"/>
-          <w:b/>
-        </w:rPr>
-        <w:t xml:space="preserve">d more complicated. As a result, </w:t>
+        <w:t xml:space="preserve">Hint: Starting from this week, the code will be </w:t>
+      </w:r>
+      <w:proofErr w:type="gramStart"/>
+      <w:r>
+        <w:rPr>
+          <w:rFonts w:eastAsia="Times New Roman" w:cstheme="minorHAnsi"/>
+          <w:b/>
+        </w:rPr>
+        <w:t>more an</w:t>
+      </w:r>
+      <w:r>
+        <w:rPr>
+          <w:rFonts w:eastAsia="Times New Roman" w:cstheme="minorHAnsi"/>
+          <w:b/>
+        </w:rPr>
+        <w:t>d more</w:t>
+      </w:r>
+      <w:proofErr w:type="gramEnd"/>
+      <w:r>
+        <w:rPr>
+          <w:rFonts w:eastAsia="Times New Roman" w:cstheme="minorHAnsi"/>
+          <w:b/>
+        </w:rPr>
+        <w:t xml:space="preserve"> complicated. As a result, </w:t>
       </w:r>
       <w:r>
         <w:rPr>
@@ -1004,12 +1054,14 @@
           <w:rFonts w:eastAsia="Times New Roman" w:cstheme="minorHAnsi"/>
         </w:rPr>
       </w:pPr>
+      <w:proofErr w:type="spellStart"/>
       <w:r>
         <w:rPr>
           <w:rFonts w:eastAsia="Times New Roman" w:cstheme="minorHAnsi"/>
         </w:rPr>
         <w:t>parser.c</w:t>
       </w:r>
+      <w:proofErr w:type="spellEnd"/>
       <w:r>
         <w:rPr>
           <w:rFonts w:eastAsia="Times New Roman" w:cstheme="minorHAnsi"/>
@@ -1088,7 +1140,23 @@
           <w:b/>
         </w:rPr>
         <w:tab/>
-        <w:t xml:space="preserve">- This file includes the major functions you need to finish in this lab, you need to read the data structure </w:t>
+        <w:t xml:space="preserve">- This file includes the major functions you need to finish in this </w:t>
+      </w:r>
+      <w:proofErr w:type="gramStart"/>
+      <w:r>
+        <w:rPr>
+          <w:rFonts w:eastAsia="Times New Roman" w:cstheme="minorHAnsi"/>
+          <w:b/>
+        </w:rPr>
+        <w:t>lab,</w:t>
+      </w:r>
+      <w:proofErr w:type="gramEnd"/>
+      <w:r>
+        <w:rPr>
+          <w:rFonts w:eastAsia="Times New Roman" w:cstheme="minorHAnsi"/>
+          <w:b/>
+        </w:rPr>
+        <w:t xml:space="preserve"> you need to read the data structure </w:t>
       </w:r>
       <w:r>
         <w:rPr>
@@ -1119,7 +1187,23 @@
           <w:rFonts w:eastAsia="Times New Roman" w:cstheme="minorHAnsi"/>
           <w:b/>
         </w:rPr>
-        <w:t xml:space="preserve"> by parser.c to hold both CODE and DATA section of the assembly code in MIPS.asm and convert them into machine code based on MIPS instruction set. </w:t>
+        <w:t xml:space="preserve"> by </w:t>
+      </w:r>
+      <w:proofErr w:type="spellStart"/>
+      <w:r>
+        <w:rPr>
+          <w:rFonts w:eastAsia="Times New Roman" w:cstheme="minorHAnsi"/>
+          <w:b/>
+        </w:rPr>
+        <w:t>parser.c</w:t>
+      </w:r>
+      <w:proofErr w:type="spellEnd"/>
+      <w:r>
+        <w:rPr>
+          <w:rFonts w:eastAsia="Times New Roman" w:cstheme="minorHAnsi"/>
+          <w:b/>
+        </w:rPr>
+        <w:t xml:space="preserve"> to hold both CODE and DATA section of the assembly code in MIPS.asm and convert them into machine code based on MIPS instruction set. </w:t>
       </w:r>
       <w:r>
         <w:rPr>
@@ -1127,7 +1211,25 @@
           <w:b/>
           <w:color w:val="FF0000"/>
         </w:rPr>
-        <w:t xml:space="preserve">You only need to change this file in </w:t>
+        <w:t xml:space="preserve">You only need to change this file </w:t>
+      </w:r>
+      <w:proofErr w:type="gramStart"/>
+      <w:r>
+        <w:rPr>
+          <w:rFonts w:eastAsia="Times New Roman" w:cstheme="minorHAnsi"/>
+          <w:b/>
+          <w:color w:val="FF0000"/>
+        </w:rPr>
+        <w:t>in</w:t>
+      </w:r>
+      <w:proofErr w:type="gramEnd"/>
+      <w:r>
+        <w:rPr>
+          <w:rFonts w:eastAsia="Times New Roman" w:cstheme="minorHAnsi"/>
+          <w:b/>
+          <w:color w:val="FF0000"/>
+        </w:rPr>
+        <w:t xml:space="preserve"> </w:t>
       </w:r>
       <w:r>
         <w:rPr>
@@ -1172,12 +1274,14 @@
           <w:rFonts w:eastAsia="Times New Roman" w:cstheme="minorHAnsi"/>
         </w:rPr>
       </w:pPr>
+      <w:proofErr w:type="spellStart"/>
       <w:r>
         <w:rPr>
           <w:rFonts w:eastAsia="Times New Roman" w:cstheme="minorHAnsi"/>
         </w:rPr>
         <w:t>memory.c</w:t>
       </w:r>
+      <w:proofErr w:type="spellEnd"/>
       <w:r>
         <w:rPr>
           <w:rFonts w:eastAsia="Times New Roman" w:cstheme="minorHAnsi"/>
@@ -1247,12 +1351,21 @@
         </w:rPr>
         <w:t xml:space="preserve"> </w:t>
       </w:r>
+      <w:proofErr w:type="spellStart"/>
       <w:r>
         <w:rPr>
           <w:rFonts w:eastAsia="Times New Roman" w:cstheme="minorHAnsi"/>
           <w:color w:val="FF0000"/>
         </w:rPr>
-        <w:t xml:space="preserve">memory.c </w:t>
+        <w:t>memory.c</w:t>
+      </w:r>
+      <w:proofErr w:type="spellEnd"/>
+      <w:r>
+        <w:rPr>
+          <w:rFonts w:eastAsia="Times New Roman" w:cstheme="minorHAnsi"/>
+          <w:color w:val="FF0000"/>
+        </w:rPr>
+        <w:t xml:space="preserve"> </w:t>
       </w:r>
       <w:r>
         <w:rPr>
@@ -1286,6 +1399,7 @@
           <w:rFonts w:eastAsia="Times New Roman" w:cstheme="minorHAnsi"/>
         </w:rPr>
       </w:pPr>
+      <w:proofErr w:type="spellStart"/>
       <w:r>
         <w:rPr>
           <w:rFonts w:eastAsia="Times New Roman" w:cstheme="minorHAnsi"/>
@@ -1298,6 +1412,7 @@
         </w:rPr>
         <w:t>.c</w:t>
       </w:r>
+      <w:proofErr w:type="spellEnd"/>
       <w:r>
         <w:rPr>
           <w:rFonts w:eastAsia="Times New Roman" w:cstheme="minorHAnsi"/>
@@ -1365,12 +1480,14 @@
           <w:rFonts w:eastAsia="Times New Roman" w:cstheme="minorHAnsi"/>
         </w:rPr>
       </w:pPr>
+      <w:proofErr w:type="spellStart"/>
       <w:r>
         <w:rPr>
           <w:rFonts w:eastAsia="Times New Roman" w:cstheme="minorHAnsi"/>
         </w:rPr>
         <w:t>header.h</w:t>
       </w:r>
+      <w:proofErr w:type="spellEnd"/>
       <w:r>
         <w:rPr>
           <w:rFonts w:eastAsia="Times New Roman" w:cstheme="minorHAnsi"/>
@@ -1397,6 +1514,7 @@
           <w:rFonts w:eastAsia="Times New Roman" w:cstheme="minorHAnsi"/>
         </w:rPr>
       </w:pPr>
+      <w:proofErr w:type="spellStart"/>
       <w:r>
         <w:rPr>
           <w:rFonts w:eastAsia="Times New Roman" w:cstheme="minorHAnsi"/>
@@ -1409,12 +1527,27 @@
         </w:rPr>
         <w:t>.h</w:t>
       </w:r>
+      <w:proofErr w:type="spellEnd"/>
       <w:r>
         <w:rPr>
           <w:rFonts w:eastAsia="Times New Roman" w:cstheme="minorHAnsi"/>
         </w:rPr>
         <w:tab/>
-        <w:t>- The header files for parser.c file.</w:t>
+        <w:t xml:space="preserve">- The header files for </w:t>
+      </w:r>
+      <w:proofErr w:type="spellStart"/>
+      <w:r>
+        <w:rPr>
+          <w:rFonts w:eastAsia="Times New Roman" w:cstheme="minorHAnsi"/>
+        </w:rPr>
+        <w:t>parser.c</w:t>
+      </w:r>
+      <w:proofErr w:type="spellEnd"/>
+      <w:r>
+        <w:rPr>
+          <w:rFonts w:eastAsia="Times New Roman" w:cstheme="minorHAnsi"/>
+        </w:rPr>
+        <w:t xml:space="preserve"> file.</w:t>
       </w:r>
     </w:p>
     <w:p>
@@ -1435,6 +1568,7 @@
           <w:rFonts w:eastAsia="Times New Roman" w:cstheme="minorHAnsi"/>
         </w:rPr>
       </w:pPr>
+      <w:proofErr w:type="gramStart"/>
       <w:r>
         <w:rPr>
           <w:rFonts w:eastAsia="Times New Roman" w:cstheme="minorHAnsi"/>
@@ -1452,7 +1586,14 @@
           <w:rFonts w:eastAsia="Times New Roman" w:cstheme="minorHAnsi"/>
         </w:rPr>
         <w:tab/>
-        <w:t xml:space="preserve">- The assembly code for the testing of the program running on the simulator. </w:t>
+        <w:t>-</w:t>
+      </w:r>
+      <w:proofErr w:type="gramEnd"/>
+      <w:r>
+        <w:rPr>
+          <w:rFonts w:eastAsia="Times New Roman" w:cstheme="minorHAnsi"/>
+        </w:rPr>
+        <w:t xml:space="preserve"> The assembly code for the testing of the program running on the simulator. </w:t>
       </w:r>
     </w:p>
     <w:p>
@@ -1713,7 +1854,21 @@
         <w:rPr>
           <w:rFonts w:eastAsia="Times New Roman" w:cstheme="minorHAnsi"/>
         </w:rPr>
-        <w:t xml:space="preserve"> command. Please notice that different IDE would have different settings, you may need to </w:t>
+        <w:t xml:space="preserve"> command. Please </w:t>
+      </w:r>
+      <w:proofErr w:type="gramStart"/>
+      <w:r>
+        <w:rPr>
+          <w:rFonts w:eastAsia="Times New Roman" w:cstheme="minorHAnsi"/>
+        </w:rPr>
+        <w:t>notice</w:t>
+      </w:r>
+      <w:proofErr w:type="gramEnd"/>
+      <w:r>
+        <w:rPr>
+          <w:rFonts w:eastAsia="Times New Roman" w:cstheme="minorHAnsi"/>
+        </w:rPr>
+        <w:t xml:space="preserve"> that different IDE would have different settings, you may need to </w:t>
       </w:r>
       <w:r>
         <w:rPr>
@@ -1745,12 +1900,16 @@
         </w:rPr>
         <w:t xml:space="preserve"> The following screenshot is for </w:t>
       </w:r>
+      <w:proofErr w:type="spellStart"/>
+      <w:proofErr w:type="gramStart"/>
       <w:r>
         <w:rPr>
           <w:rFonts w:eastAsia="Times New Roman" w:cstheme="minorHAnsi"/>
         </w:rPr>
         <w:t>Code:Blocks</w:t>
       </w:r>
+      <w:proofErr w:type="spellEnd"/>
+      <w:proofErr w:type="gramEnd"/>
       <w:r>
         <w:rPr>
           <w:rFonts w:eastAsia="Times New Roman" w:cstheme="minorHAnsi"/>
@@ -1905,7 +2064,7 @@
           </mc:Choice>
           <mc:Fallback>
             <w:pict>
-              <v:group w14:anchorId="57718A57" id="Group 4" o:spid="_x0000_s1026" style="position:absolute;margin-left:139.3pt;margin-top:-16.45pt;width:161.6pt;height:251.2pt;z-index:251661312" coordsize="20523,31902" o:gfxdata="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">
+              <v:group w14:anchorId="36731B8C" id="Group 4" o:spid="_x0000_s1026" style="position:absolute;margin-left:139.3pt;margin-top:-16.45pt;width:161.6pt;height:251.2pt;z-index:251661312" coordsize="20523,31902" o:gfxdata="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">
                 <v:shapetype id="_x0000_t75" coordsize="21600,21600" o:spt="75" o:preferrelative="t" path="m@4@5l@4@11@9@11@9@5xe" filled="f" stroked="f">
                   <v:stroke joinstyle="miter"/>
                   <v:formulas>
@@ -2019,6 +2178,7 @@
         </w:rPr>
         <w:t xml:space="preserve">read the comments in function </w:t>
       </w:r>
+      <w:proofErr w:type="spellStart"/>
       <w:r>
         <w:rPr>
           <w:rFonts w:ascii="Courier New" w:eastAsia="Times New Roman" w:hAnsi="Courier New" w:cs="Courier New"/>
@@ -2026,6 +2186,7 @@
         </w:rPr>
         <w:t>loadCodeToMem</w:t>
       </w:r>
+      <w:proofErr w:type="spellEnd"/>
       <w:r>
         <w:rPr>
           <w:rFonts w:eastAsia="Times New Roman" w:cstheme="minorHAnsi"/>
@@ -2150,12 +2311,21 @@
           <w:b/>
         </w:rPr>
       </w:pPr>
+      <w:proofErr w:type="spellStart"/>
       <w:r>
         <w:rPr>
           <w:rFonts w:ascii="Courier New" w:eastAsia="Times New Roman" w:hAnsi="Courier New" w:cs="Courier New"/>
           <w:b/>
         </w:rPr>
-        <w:t>setupDataMemory,</w:t>
+        <w:t>setupDataMemory</w:t>
+      </w:r>
+      <w:proofErr w:type="spellEnd"/>
+      <w:r>
+        <w:rPr>
+          <w:rFonts w:ascii="Courier New" w:eastAsia="Times New Roman" w:hAnsi="Courier New" w:cs="Courier New"/>
+          <w:b/>
+        </w:rPr>
+        <w:t>,</w:t>
       </w:r>
     </w:p>
     <w:p>
@@ -2169,6 +2339,7 @@
           <w:i/>
         </w:rPr>
       </w:pPr>
+      <w:proofErr w:type="spellStart"/>
       <w:r>
         <w:rPr>
           <w:rFonts w:ascii="Courier New" w:eastAsia="Times New Roman" w:hAnsi="Courier New" w:cs="Courier New"/>
@@ -2176,6 +2347,7 @@
         </w:rPr>
         <w:t>setupInstructionMemory</w:t>
       </w:r>
+      <w:proofErr w:type="spellEnd"/>
       <w:r>
         <w:rPr>
           <w:rFonts w:ascii="Courier New" w:eastAsia="Times New Roman" w:hAnsi="Courier New" w:cs="Courier New"/>
@@ -2205,6 +2377,7 @@
         </w:rPr>
         <w:t xml:space="preserve">Notice: Before you finish function </w:t>
       </w:r>
+      <w:proofErr w:type="spellStart"/>
       <w:r>
         <w:rPr>
           <w:rFonts w:ascii="Courier New" w:eastAsia="Times New Roman" w:hAnsi="Courier New" w:cs="Courier New"/>
@@ -2220,6 +2393,7 @@
         </w:rPr>
         <w:t>InstructionMemory</w:t>
       </w:r>
+      <w:proofErr w:type="spellEnd"/>
       <w:r>
         <w:rPr>
           <w:rFonts w:eastAsia="Times New Roman" w:cstheme="minorHAnsi"/>

</xml_diff>